<commit_message>
Refresh 15 Oct sprint report and clarification requests with latest Jira data
Co-Authored-By: Claude Opus 5.5 <noreply@anthropic.com>
Claude-Session: https://claude.ai/code/session_0128GGMJqj1fgFawc5fV1mHg
</commit_message>
<xml_diff>
--- a/reports/Clarification_Requests_2026-10-15.docx
+++ b/reports/Clarification_Requests_2026-10-15.docx
@@ -1705,418 +1705,6 @@
           <w:color w:val="1F3A5F"/>
           <w:sz w:val="24"/>
         </w:rPr>
-        <w:t>To: Kunal Jangid   (Web Marketing)</w:t>
-      </w:r>
-    </w:p>
-    <w:p>
-      <w:r>
-        <w:rPr>
-          <w:b/>
-        </w:rPr>
-        <w:t>Subject: Clarification needed – 5 ticket(s) past due date or over estimate</w:t>
-      </w:r>
-    </w:p>
-    <w:p>
-      <w:r>
-        <w:t>Hi Kunal,</w:t>
-      </w:r>
-    </w:p>
-    <w:p>
-      <w:r>
-        <w:t>The following ticket(s) assigned to you in the current sprint have passed their due date or logged more time than the original estimate in Jira. Could you please reply with:</w:t>
-      </w:r>
-    </w:p>
-    <w:p>
-      <w:pPr>
-        <w:pStyle w:val="ListBullet"/>
-      </w:pPr>
-      <w:r>
-        <w:t>the reason for the delay (blocker, dependency, scope change or estimate),</w:t>
-      </w:r>
-    </w:p>
-    <w:p>
-      <w:pPr>
-        <w:pStyle w:val="ListBullet"/>
-      </w:pPr>
-      <w:r>
-        <w:t>the revised completion date, and</w:t>
-      </w:r>
-    </w:p>
-    <w:p>
-      <w:pPr>
-        <w:pStyle w:val="ListBullet"/>
-      </w:pPr>
-      <w:r>
-        <w:t>any help you need to close it.</w:t>
-      </w:r>
-    </w:p>
-    <w:tbl>
-      <w:tblPr>
-        <w:tblStyle w:val="TableGrid"/>
-        <w:tblW w:type="auto" w:w="0"/>
-        <w:tblLayout w:type="fixed"/>
-        <w:tblLook w:firstColumn="1" w:firstRow="1" w:lastColumn="0" w:lastRow="0" w:noHBand="0" w:noVBand="1" w:val="04A0"/>
-      </w:tblPr>
-      <w:tblGrid>
-        <w:gridCol w:w="1152"/>
-        <w:gridCol w:w="4320"/>
-        <w:gridCol w:w="1008"/>
-        <w:gridCol w:w="1584"/>
-        <w:gridCol w:w="1440"/>
-      </w:tblGrid>
-      <w:tr>
-        <w:tc>
-          <w:tcPr>
-            <w:tcW w:type="dxa" w:w="1152"/>
-          </w:tcPr>
-          <w:p>
-            <w:r>
-              <w:rPr>
-                <w:b/>
-              </w:rPr>
-              <w:t>Ticket</w:t>
-            </w:r>
-          </w:p>
-        </w:tc>
-        <w:tc>
-          <w:tcPr>
-            <w:tcW w:type="dxa" w:w="4320"/>
-          </w:tcPr>
-          <w:p>
-            <w:r>
-              <w:rPr>
-                <w:b/>
-              </w:rPr>
-              <w:t>Summary</w:t>
-            </w:r>
-          </w:p>
-        </w:tc>
-        <w:tc>
-          <w:tcPr>
-            <w:tcW w:type="dxa" w:w="1008"/>
-          </w:tcPr>
-          <w:p>
-            <w:r>
-              <w:rPr>
-                <w:b/>
-              </w:rPr>
-              <w:t>Due date</w:t>
-            </w:r>
-          </w:p>
-        </w:tc>
-        <w:tc>
-          <w:tcPr>
-            <w:tcW w:type="dxa" w:w="1584"/>
-          </w:tcPr>
-          <w:p>
-            <w:r>
-              <w:rPr>
-                <w:b/>
-              </w:rPr>
-              <w:t>Current status</w:t>
-            </w:r>
-          </w:p>
-        </w:tc>
-        <w:tc>
-          <w:tcPr>
-            <w:tcW w:type="dxa" w:w="1440"/>
-          </w:tcPr>
-          <w:p>
-            <w:r>
-              <w:rPr>
-                <w:b/>
-              </w:rPr>
-              <w:t>Estimate / Logged</w:t>
-            </w:r>
-          </w:p>
-        </w:tc>
-      </w:tr>
-      <w:tr>
-        <w:tc>
-          <w:tcPr>
-            <w:tcW w:type="dxa" w:w="1152"/>
-          </w:tcPr>
-          <w:p>
-            <w:r>
-              <w:t>MR-1324</w:t>
-            </w:r>
-          </w:p>
-        </w:tc>
-        <w:tc>
-          <w:tcPr>
-            <w:tcW w:type="dxa" w:w="4320"/>
-          </w:tcPr>
-          <w:p>
-            <w:r>
-              <w:t>Mobile Header Design Update</w:t>
-            </w:r>
-          </w:p>
-        </w:tc>
-        <w:tc>
-          <w:tcPr>
-            <w:tcW w:type="dxa" w:w="1008"/>
-          </w:tcPr>
-          <w:p>
-            <w:r>
-              <w:t>—</w:t>
-            </w:r>
-          </w:p>
-        </w:tc>
-        <w:tc>
-          <w:tcPr>
-            <w:tcW w:type="dxa" w:w="1584"/>
-          </w:tcPr>
-          <w:p>
-            <w:r>
-              <w:t>Ready for Prod</w:t>
-            </w:r>
-          </w:p>
-        </w:tc>
-        <w:tc>
-          <w:tcPr>
-            <w:tcW w:type="dxa" w:w="1440"/>
-          </w:tcPr>
-          <w:p>
-            <w:r>
-              <w:t>2h / 3.5h</w:t>
-            </w:r>
-          </w:p>
-        </w:tc>
-      </w:tr>
-      <w:tr>
-        <w:tc>
-          <w:tcPr>
-            <w:tcW w:type="dxa" w:w="1152"/>
-          </w:tcPr>
-          <w:p>
-            <w:r>
-              <w:t>MR-1339</w:t>
-            </w:r>
-          </w:p>
-        </w:tc>
-        <w:tc>
-          <w:tcPr>
-            <w:tcW w:type="dxa" w:w="4320"/>
-          </w:tcPr>
-          <w:p>
-            <w:r>
-              <w:t>Solutions and Focus Areas order mismatch with Figma; More section displays old UI</w:t>
-            </w:r>
-          </w:p>
-        </w:tc>
-        <w:tc>
-          <w:tcPr>
-            <w:tcW w:type="dxa" w:w="1008"/>
-          </w:tcPr>
-          <w:p>
-            <w:r>
-              <w:t>13 Oct</w:t>
-            </w:r>
-          </w:p>
-        </w:tc>
-        <w:tc>
-          <w:tcPr>
-            <w:tcW w:type="dxa" w:w="1584"/>
-          </w:tcPr>
-          <w:p>
-            <w:r>
-              <w:t>Ready for Prod</w:t>
-            </w:r>
-          </w:p>
-        </w:tc>
-        <w:tc>
-          <w:tcPr>
-            <w:tcW w:type="dxa" w:w="1440"/>
-          </w:tcPr>
-          <w:p>
-            <w:r>
-              <w:t>1h / 2h</w:t>
-            </w:r>
-          </w:p>
-        </w:tc>
-      </w:tr>
-      <w:tr>
-        <w:tc>
-          <w:tcPr>
-            <w:tcW w:type="dxa" w:w="1152"/>
-          </w:tcPr>
-          <w:p>
-            <w:r>
-              <w:t>MR-1340</w:t>
-            </w:r>
-          </w:p>
-        </w:tc>
-        <w:tc>
-          <w:tcPr>
-            <w:tcW w:type="dxa" w:w="4320"/>
-          </w:tcPr>
-          <w:p>
-            <w:r>
-              <w:t>Update Footer Design as per figma</w:t>
-            </w:r>
-          </w:p>
-        </w:tc>
-        <w:tc>
-          <w:tcPr>
-            <w:tcW w:type="dxa" w:w="1008"/>
-          </w:tcPr>
-          <w:p>
-            <w:r>
-              <w:t>9 Oct</w:t>
-            </w:r>
-          </w:p>
-        </w:tc>
-        <w:tc>
-          <w:tcPr>
-            <w:tcW w:type="dxa" w:w="1584"/>
-          </w:tcPr>
-          <w:p>
-            <w:r>
-              <w:t>Ready for Prod</w:t>
-            </w:r>
-          </w:p>
-        </w:tc>
-        <w:tc>
-          <w:tcPr>
-            <w:tcW w:type="dxa" w:w="1440"/>
-          </w:tcPr>
-          <w:p>
-            <w:r>
-              <w:t>2h / 2.5h</w:t>
-            </w:r>
-          </w:p>
-        </w:tc>
-      </w:tr>
-      <w:tr>
-        <w:tc>
-          <w:tcPr>
-            <w:tcW w:type="dxa" w:w="1152"/>
-          </w:tcPr>
-          <w:p>
-            <w:r>
-              <w:t>MR-1353</w:t>
-            </w:r>
-          </w:p>
-        </w:tc>
-        <w:tc>
-          <w:tcPr>
-            <w:tcW w:type="dxa" w:w="4320"/>
-          </w:tcPr>
-          <w:p>
-            <w:r>
-              <w:t>GDPR &gt; Hero Content – “Access Our In-Depth Report” Text Has Inconsistent Font Weight</w:t>
-            </w:r>
-          </w:p>
-        </w:tc>
-        <w:tc>
-          <w:tcPr>
-            <w:tcW w:type="dxa" w:w="1008"/>
-          </w:tcPr>
-          <w:p>
-            <w:r>
-              <w:t>15 Oct</w:t>
-            </w:r>
-          </w:p>
-        </w:tc>
-        <w:tc>
-          <w:tcPr>
-            <w:tcW w:type="dxa" w:w="1584"/>
-          </w:tcPr>
-          <w:p>
-            <w:r>
-              <w:t>In Prod1</w:t>
-            </w:r>
-          </w:p>
-        </w:tc>
-        <w:tc>
-          <w:tcPr>
-            <w:tcW w:type="dxa" w:w="1440"/>
-          </w:tcPr>
-          <w:p>
-            <w:r>
-              <w:t>0.5h / 1.3h</w:t>
-            </w:r>
-          </w:p>
-        </w:tc>
-      </w:tr>
-      <w:tr>
-        <w:tc>
-          <w:tcPr>
-            <w:tcW w:type="dxa" w:w="1152"/>
-          </w:tcPr>
-          <w:p>
-            <w:r>
-              <w:t>MR-1356</w:t>
-            </w:r>
-          </w:p>
-        </w:tc>
-        <w:tc>
-          <w:tcPr>
-            <w:tcW w:type="dxa" w:w="4320"/>
-          </w:tcPr>
-          <w:p>
-            <w:r>
-              <w:t>Update background of Article Section from Linear gradient to white</w:t>
-            </w:r>
-          </w:p>
-        </w:tc>
-        <w:tc>
-          <w:tcPr>
-            <w:tcW w:type="dxa" w:w="1008"/>
-          </w:tcPr>
-          <w:p>
-            <w:r>
-              <w:t>12 Oct</w:t>
-            </w:r>
-          </w:p>
-        </w:tc>
-        <w:tc>
-          <w:tcPr>
-            <w:tcW w:type="dxa" w:w="1584"/>
-          </w:tcPr>
-          <w:p>
-            <w:r>
-              <w:t>In Prod1</w:t>
-            </w:r>
-          </w:p>
-        </w:tc>
-        <w:tc>
-          <w:tcPr>
-            <w:tcW w:type="dxa" w:w="1440"/>
-          </w:tcPr>
-          <w:p>
-            <w:r>
-              <w:t>—</w:t>
-            </w:r>
-          </w:p>
-        </w:tc>
-      </w:tr>
-    </w:tbl>
-    <w:p/>
-    <w:p>
-      <w:r>
-        <w:t>Please also update the due date in Jira if it has changed.</w:t>
-      </w:r>
-    </w:p>
-    <w:p>
-      <w:r>
-        <w:t>Thanks,</w:t>
-        <w:br/>
-        <w:t>Shashi</w:t>
-      </w:r>
-    </w:p>
-    <w:p>
-      <w:r>
-        <w:br w:type="page"/>
-      </w:r>
-    </w:p>
-    <w:p>
-      <w:r>
-        <w:rPr>
-          <w:b/>
-          <w:color w:val="1F3A5F"/>
-          <w:sz w:val="24"/>
-        </w:rPr>
         <w:t>To: Livian Stefan Stan   (USP)</w:t>
       </w:r>
     </w:p>
@@ -3133,314 +2721,6 @@
           <w:color w:val="1F3A5F"/>
           <w:sz w:val="24"/>
         </w:rPr>
-        <w:t>To: Kannan Elangovan   (Web Marketing)</w:t>
-      </w:r>
-    </w:p>
-    <w:p>
-      <w:r>
-        <w:rPr>
-          <w:b/>
-        </w:rPr>
-        <w:t>Subject: Clarification needed – 3 ticket(s) over estimate</w:t>
-      </w:r>
-    </w:p>
-    <w:p>
-      <w:r>
-        <w:t>Hi Kannan,</w:t>
-      </w:r>
-    </w:p>
-    <w:p>
-      <w:r>
-        <w:t>The following ticket(s) assigned to you in the current sprint have logged more time than the original estimate in Jira. Could you please reply with:</w:t>
-      </w:r>
-    </w:p>
-    <w:p>
-      <w:pPr>
-        <w:pStyle w:val="ListBullet"/>
-      </w:pPr>
-      <w:r>
-        <w:t>the reason for the delay (blocker, dependency, scope change or estimate),</w:t>
-      </w:r>
-    </w:p>
-    <w:p>
-      <w:pPr>
-        <w:pStyle w:val="ListBullet"/>
-      </w:pPr>
-      <w:r>
-        <w:t>the revised completion date, and</w:t>
-      </w:r>
-    </w:p>
-    <w:p>
-      <w:pPr>
-        <w:pStyle w:val="ListBullet"/>
-      </w:pPr>
-      <w:r>
-        <w:t>any help you need to close it.</w:t>
-      </w:r>
-    </w:p>
-    <w:tbl>
-      <w:tblPr>
-        <w:tblStyle w:val="TableGrid"/>
-        <w:tblW w:type="auto" w:w="0"/>
-        <w:tblLayout w:type="fixed"/>
-        <w:tblLook w:firstColumn="1" w:firstRow="1" w:lastColumn="0" w:lastRow="0" w:noHBand="0" w:noVBand="1" w:val="04A0"/>
-      </w:tblPr>
-      <w:tblGrid>
-        <w:gridCol w:w="1152"/>
-        <w:gridCol w:w="4320"/>
-        <w:gridCol w:w="1008"/>
-        <w:gridCol w:w="1584"/>
-        <w:gridCol w:w="1440"/>
-      </w:tblGrid>
-      <w:tr>
-        <w:tc>
-          <w:tcPr>
-            <w:tcW w:type="dxa" w:w="1152"/>
-          </w:tcPr>
-          <w:p>
-            <w:r>
-              <w:rPr>
-                <w:b/>
-              </w:rPr>
-              <w:t>Ticket</w:t>
-            </w:r>
-          </w:p>
-        </w:tc>
-        <w:tc>
-          <w:tcPr>
-            <w:tcW w:type="dxa" w:w="4320"/>
-          </w:tcPr>
-          <w:p>
-            <w:r>
-              <w:rPr>
-                <w:b/>
-              </w:rPr>
-              <w:t>Summary</w:t>
-            </w:r>
-          </w:p>
-        </w:tc>
-        <w:tc>
-          <w:tcPr>
-            <w:tcW w:type="dxa" w:w="1008"/>
-          </w:tcPr>
-          <w:p>
-            <w:r>
-              <w:rPr>
-                <w:b/>
-              </w:rPr>
-              <w:t>Due date</w:t>
-            </w:r>
-          </w:p>
-        </w:tc>
-        <w:tc>
-          <w:tcPr>
-            <w:tcW w:type="dxa" w:w="1584"/>
-          </w:tcPr>
-          <w:p>
-            <w:r>
-              <w:rPr>
-                <w:b/>
-              </w:rPr>
-              <w:t>Current status</w:t>
-            </w:r>
-          </w:p>
-        </w:tc>
-        <w:tc>
-          <w:tcPr>
-            <w:tcW w:type="dxa" w:w="1440"/>
-          </w:tcPr>
-          <w:p>
-            <w:r>
-              <w:rPr>
-                <w:b/>
-              </w:rPr>
-              <w:t>Estimate / Logged</w:t>
-            </w:r>
-          </w:p>
-        </w:tc>
-      </w:tr>
-      <w:tr>
-        <w:tc>
-          <w:tcPr>
-            <w:tcW w:type="dxa" w:w="1152"/>
-          </w:tcPr>
-          <w:p>
-            <w:r>
-              <w:t>MR-1330</w:t>
-            </w:r>
-          </w:p>
-        </w:tc>
-        <w:tc>
-          <w:tcPr>
-            <w:tcW w:type="dxa" w:w="4320"/>
-          </w:tcPr>
-          <w:p>
-            <w:r>
-              <w:t>Font Size and Text Content Differ from Figma</w:t>
-            </w:r>
-          </w:p>
-        </w:tc>
-        <w:tc>
-          <w:tcPr>
-            <w:tcW w:type="dxa" w:w="1008"/>
-          </w:tcPr>
-          <w:p>
-            <w:r>
-              <w:t>—</w:t>
-            </w:r>
-          </w:p>
-        </w:tc>
-        <w:tc>
-          <w:tcPr>
-            <w:tcW w:type="dxa" w:w="1584"/>
-          </w:tcPr>
-          <w:p>
-            <w:r>
-              <w:t>In Prod1</w:t>
-            </w:r>
-          </w:p>
-        </w:tc>
-        <w:tc>
-          <w:tcPr>
-            <w:tcW w:type="dxa" w:w="1440"/>
-          </w:tcPr>
-          <w:p>
-            <w:r>
-              <w:t>0.5h / 1h</w:t>
-            </w:r>
-          </w:p>
-        </w:tc>
-      </w:tr>
-      <w:tr>
-        <w:tc>
-          <w:tcPr>
-            <w:tcW w:type="dxa" w:w="1152"/>
-          </w:tcPr>
-          <w:p>
-            <w:r>
-              <w:t>MR-1331</w:t>
-            </w:r>
-          </w:p>
-        </w:tc>
-        <w:tc>
-          <w:tcPr>
-            <w:tcW w:type="dxa" w:w="4320"/>
-          </w:tcPr>
-          <w:p>
-            <w:r>
-              <w:t>Explore Datacenter Button Redirects to Incorrect Page</w:t>
-            </w:r>
-          </w:p>
-        </w:tc>
-        <w:tc>
-          <w:tcPr>
-            <w:tcW w:type="dxa" w:w="1008"/>
-          </w:tcPr>
-          <w:p>
-            <w:r>
-              <w:t>—</w:t>
-            </w:r>
-          </w:p>
-        </w:tc>
-        <w:tc>
-          <w:tcPr>
-            <w:tcW w:type="dxa" w:w="1584"/>
-          </w:tcPr>
-          <w:p>
-            <w:r>
-              <w:t>In Prod1</w:t>
-            </w:r>
-          </w:p>
-        </w:tc>
-        <w:tc>
-          <w:tcPr>
-            <w:tcW w:type="dxa" w:w="1440"/>
-          </w:tcPr>
-          <w:p>
-            <w:r>
-              <w:t>0.5h / 1h</w:t>
-            </w:r>
-          </w:p>
-        </w:tc>
-      </w:tr>
-      <w:tr>
-        <w:tc>
-          <w:tcPr>
-            <w:tcW w:type="dxa" w:w="1152"/>
-          </w:tcPr>
-          <w:p>
-            <w:r>
-              <w:t>MR-1332</w:t>
-            </w:r>
-          </w:p>
-        </w:tc>
-        <w:tc>
-          <w:tcPr>
-            <w:tcW w:type="dxa" w:w="4320"/>
-          </w:tcPr>
-          <w:p>
-            <w:r>
-              <w:t>Third Card Content Differs from Figma</w:t>
-            </w:r>
-          </w:p>
-        </w:tc>
-        <w:tc>
-          <w:tcPr>
-            <w:tcW w:type="dxa" w:w="1008"/>
-          </w:tcPr>
-          <w:p>
-            <w:r>
-              <w:t>—</w:t>
-            </w:r>
-          </w:p>
-        </w:tc>
-        <w:tc>
-          <w:tcPr>
-            <w:tcW w:type="dxa" w:w="1584"/>
-          </w:tcPr>
-          <w:p>
-            <w:r>
-              <w:t>In Prod1</w:t>
-            </w:r>
-          </w:p>
-        </w:tc>
-        <w:tc>
-          <w:tcPr>
-            <w:tcW w:type="dxa" w:w="1440"/>
-          </w:tcPr>
-          <w:p>
-            <w:r>
-              <w:t>0.5h / 0.9h</w:t>
-            </w:r>
-          </w:p>
-        </w:tc>
-      </w:tr>
-    </w:tbl>
-    <w:p/>
-    <w:p>
-      <w:r>
-        <w:t>Please also update the due date in Jira if it has changed.</w:t>
-      </w:r>
-    </w:p>
-    <w:p>
-      <w:r>
-        <w:t>Thanks,</w:t>
-        <w:br/>
-        <w:t>Shashi</w:t>
-      </w:r>
-    </w:p>
-    <w:p>
-      <w:r>
-        <w:br w:type="page"/>
-      </w:r>
-    </w:p>
-    <w:p>
-      <w:r>
-        <w:rPr>
-          <w:b/>
-          <w:color w:val="1F3A5F"/>
-          <w:sz w:val="24"/>
-        </w:rPr>
         <w:t>To: Saravana Kumar   (Web Identity)</w:t>
       </w:r>
     </w:p>
@@ -4053,186 +3333,6 @@
           <w:color w:val="1F3A5F"/>
           <w:sz w:val="24"/>
         </w:rPr>
-        <w:t>To: Saurabh Jain   (Web Marketplace)</w:t>
-      </w:r>
-    </w:p>
-    <w:p>
-      <w:r>
-        <w:rPr>
-          <w:b/>
-        </w:rPr>
-        <w:t>Subject: Clarification needed – 1 ticket(s) past due date</w:t>
-      </w:r>
-    </w:p>
-    <w:p>
-      <w:r>
-        <w:t>Hi Saurabh,</w:t>
-      </w:r>
-    </w:p>
-    <w:p>
-      <w:r>
-        <w:t>The following ticket(s) assigned to you in the current sprint have passed their due date in Jira. Could you please reply with:</w:t>
-      </w:r>
-    </w:p>
-    <w:p>
-      <w:pPr>
-        <w:pStyle w:val="ListBullet"/>
-      </w:pPr>
-      <w:r>
-        <w:t>the reason for the delay (blocker, dependency, scope change or estimate),</w:t>
-      </w:r>
-    </w:p>
-    <w:p>
-      <w:pPr>
-        <w:pStyle w:val="ListBullet"/>
-      </w:pPr>
-      <w:r>
-        <w:t>the revised completion date, and</w:t>
-      </w:r>
-    </w:p>
-    <w:p>
-      <w:pPr>
-        <w:pStyle w:val="ListBullet"/>
-      </w:pPr>
-      <w:r>
-        <w:t>any help you need to close it.</w:t>
-      </w:r>
-    </w:p>
-    <w:tbl>
-      <w:tblPr>
-        <w:tblStyle w:val="TableGrid"/>
-        <w:tblW w:type="auto" w:w="0"/>
-        <w:tblLayout w:type="fixed"/>
-        <w:tblLook w:firstColumn="1" w:firstRow="1" w:lastColumn="0" w:lastRow="0" w:noHBand="0" w:noVBand="1" w:val="04A0"/>
-      </w:tblPr>
-      <w:tblGrid>
-        <w:gridCol w:w="1152"/>
-        <w:gridCol w:w="4320"/>
-        <w:gridCol w:w="1008"/>
-        <w:gridCol w:w="1584"/>
-      </w:tblGrid>
-      <w:tr>
-        <w:tc>
-          <w:tcPr>
-            <w:tcW w:type="dxa" w:w="1152"/>
-          </w:tcPr>
-          <w:p>
-            <w:r>
-              <w:rPr>
-                <w:b/>
-              </w:rPr>
-              <w:t>Ticket</w:t>
-            </w:r>
-          </w:p>
-        </w:tc>
-        <w:tc>
-          <w:tcPr>
-            <w:tcW w:type="dxa" w:w="4320"/>
-          </w:tcPr>
-          <w:p>
-            <w:r>
-              <w:rPr>
-                <w:b/>
-              </w:rPr>
-              <w:t>Summary</w:t>
-            </w:r>
-          </w:p>
-        </w:tc>
-        <w:tc>
-          <w:tcPr>
-            <w:tcW w:type="dxa" w:w="1008"/>
-          </w:tcPr>
-          <w:p>
-            <w:r>
-              <w:rPr>
-                <w:b/>
-              </w:rPr>
-              <w:t>Due date</w:t>
-            </w:r>
-          </w:p>
-        </w:tc>
-        <w:tc>
-          <w:tcPr>
-            <w:tcW w:type="dxa" w:w="1584"/>
-          </w:tcPr>
-          <w:p>
-            <w:r>
-              <w:rPr>
-                <w:b/>
-              </w:rPr>
-              <w:t>Current status</w:t>
-            </w:r>
-          </w:p>
-        </w:tc>
-      </w:tr>
-      <w:tr>
-        <w:tc>
-          <w:tcPr>
-            <w:tcW w:type="dxa" w:w="1152"/>
-          </w:tcPr>
-          <w:p>
-            <w:r>
-              <w:t>MT-1586</w:t>
-            </w:r>
-          </w:p>
-        </w:tc>
-        <w:tc>
-          <w:tcPr>
-            <w:tcW w:type="dxa" w:w="4320"/>
-          </w:tcPr>
-          <w:p>
-            <w:r>
-              <w:t>High-priority design and content review across 11 Marketplace commerce journeys</w:t>
-            </w:r>
-          </w:p>
-        </w:tc>
-        <w:tc>
-          <w:tcPr>
-            <w:tcW w:type="dxa" w:w="1008"/>
-          </w:tcPr>
-          <w:p>
-            <w:r>
-              <w:t>12 Oct</w:t>
-            </w:r>
-          </w:p>
-        </w:tc>
-        <w:tc>
-          <w:tcPr>
-            <w:tcW w:type="dxa" w:w="1584"/>
-          </w:tcPr>
-          <w:p>
-            <w:r>
-              <w:t>UAT</w:t>
-            </w:r>
-          </w:p>
-        </w:tc>
-      </w:tr>
-    </w:tbl>
-    <w:p/>
-    <w:p>
-      <w:r>
-        <w:t>Please also update the due date in Jira if it has changed.</w:t>
-      </w:r>
-    </w:p>
-    <w:p>
-      <w:r>
-        <w:t>Thanks,</w:t>
-        <w:br/>
-        <w:t>Shashi</w:t>
-      </w:r>
-    </w:p>
-    <w:p>
-      <w:r>
-        <w:br w:type="page"/>
-      </w:r>
-    </w:p>
-    <w:p>
-      <w:r>
-        <w:rPr>
-          <w:b/>
-          <w:color w:val="1F3A5F"/>
-          <w:sz w:val="24"/>
-        </w:rPr>
         <w:t>To: Suganya Murugaraj   (Web Marketplace)</w:t>
       </w:r>
     </w:p>

</xml_diff>